<commit_message>
versao 2 com cadastro paciente atualização README
</commit_message>
<xml_diff>
--- a/docs/VTAE_Manualv3.docx
+++ b/docs/VTAE_Manualv3.docx
@@ -6,8 +6,6 @@
       <w:pPr>
         <w:spacing w:after="320"/>
       </w:pPr>
-      <w:bookmarkStart w:id="0" w:name="_GoBack"/>
-      <w:bookmarkEnd w:id="0"/>
     </w:p>
     <w:p>
       <w:pPr>
@@ -201,10 +199,7 @@
       <w:proofErr w:type="spellEnd"/>
       <w:proofErr w:type="gramEnd"/>
       <w:r>
-        <w:t>): auto</w:t>
-      </w:r>
-      <w:r>
-        <w:t>matiza sistemas Windows usando visão computacional para encontrar elementos na tela por imagem.</w:t>
+        <w:t>): automatiza sistemas Windows usando visão computacional para encontrar elementos na tela por imagem.</w:t>
       </w:r>
     </w:p>
     <w:p>
@@ -256,10 +251,7 @@
       <w:proofErr w:type="spellEnd"/>
       <w:proofErr w:type="gramEnd"/>
       <w:r>
-        <w:t>): combina os</w:t>
-      </w:r>
-      <w:r>
-        <w:t xml:space="preserve"> dois — </w:t>
+        <w:t xml:space="preserve">): combina os dois — </w:t>
       </w:r>
       <w:proofErr w:type="spellStart"/>
       <w:r>
@@ -1233,16 +1225,7 @@
                 <w:sz w:val="18"/>
                 <w:szCs w:val="18"/>
               </w:rPr>
-              <w:t>playwright_r</w:t>
-            </w:r>
-            <w:r>
-              <w:rPr>
-                <w:rFonts w:ascii="Courier New" w:eastAsia="Courier New" w:hAnsi="Courier New" w:cs="Courier New"/>
-                <w:color w:val="D4D4D4"/>
-                <w:sz w:val="18"/>
-                <w:szCs w:val="18"/>
-              </w:rPr>
-              <w:t>unner.</w:t>
+              <w:t>playwright_runner.</w:t>
             </w:r>
             <w:proofErr w:type="gramEnd"/>
             <w:r>
@@ -3361,14 +3344,7 @@
                 <w:sz w:val="18"/>
                 <w:szCs w:val="18"/>
               </w:rPr>
-              <w:t>: campo_mae.png (nã</w:t>
-            </w:r>
-            <w:r>
-              <w:rPr>
-                <w:sz w:val="18"/>
-                <w:szCs w:val="18"/>
-              </w:rPr>
-              <w:t>o campo_mãe.png).</w:t>
+              <w:t>: campo_mae.png (não campo_mãe.png).</w:t>
             </w:r>
           </w:p>
           <w:p>
@@ -3611,16 +3587,7 @@
                 <w:sz w:val="18"/>
                 <w:szCs w:val="18"/>
               </w:rPr>
-              <w:t>= "si3</w:t>
-            </w:r>
-            <w:r>
-              <w:rPr>
-                <w:rFonts w:ascii="Courier New" w:eastAsia="Courier New" w:hAnsi="Courier New" w:cs="Courier New"/>
-                <w:color w:val="D4D4D4"/>
-                <w:sz w:val="18"/>
-                <w:szCs w:val="18"/>
-              </w:rPr>
-              <w:t>"</w:t>
+              <w:t>= "si3"</w:t>
             </w:r>
           </w:p>
         </w:tc>
@@ -5950,16 +5917,7 @@
                 <w:sz w:val="18"/>
                 <w:szCs w:val="18"/>
               </w:rPr>
-              <w:t>ExecutionObse</w:t>
-            </w:r>
-            <w:r>
-              <w:rPr>
-                <w:rFonts w:ascii="Courier New" w:eastAsia="Courier New" w:hAnsi="Courier New" w:cs="Courier New"/>
-                <w:color w:val="D4D4D4"/>
-                <w:sz w:val="18"/>
-                <w:szCs w:val="18"/>
-              </w:rPr>
-              <w:t>rver</w:t>
+              <w:t>ExecutionObserver</w:t>
             </w:r>
             <w:proofErr w:type="spellEnd"/>
           </w:p>
@@ -6317,16 +6275,7 @@
                 <w:sz w:val="18"/>
                 <w:szCs w:val="18"/>
               </w:rPr>
-              <w:t>t</w:t>
-            </w:r>
-            <w:r>
-              <w:rPr>
-                <w:rFonts w:ascii="Courier New" w:eastAsia="Courier New" w:hAnsi="Courier New" w:cs="Courier New"/>
-                <w:color w:val="D4D4D4"/>
-                <w:sz w:val="18"/>
-                <w:szCs w:val="18"/>
-              </w:rPr>
-              <w:t>est_meu_fluxo</w:t>
+              <w:t>test_meu_fluxo</w:t>
             </w:r>
             <w:proofErr w:type="spellEnd"/>
             <w:r>
@@ -7055,16 +7004,7 @@
                 <w:sz w:val="18"/>
                 <w:szCs w:val="18"/>
               </w:rPr>
-              <w:t>.re</w:t>
-            </w:r>
-            <w:r>
-              <w:rPr>
-                <w:rFonts w:ascii="Courier New" w:eastAsia="Courier New" w:hAnsi="Courier New" w:cs="Courier New"/>
-                <w:color w:val="D4D4D4"/>
-                <w:sz w:val="18"/>
-                <w:szCs w:val="18"/>
-              </w:rPr>
-              <w:t>port</w:t>
+              <w:t>.report</w:t>
             </w:r>
             <w:proofErr w:type="spellEnd"/>
             <w:r>
@@ -7498,14 +7438,7 @@
                 <w:sz w:val="18"/>
                 <w:szCs w:val="18"/>
               </w:rPr>
-              <w:t>c</w:t>
-            </w:r>
-            <w:r>
-              <w:rPr>
-                <w:sz w:val="18"/>
-                <w:szCs w:val="18"/>
-              </w:rPr>
-              <w:t>tx.</w:t>
+              <w:t>ctx.</w:t>
             </w:r>
             <w:proofErr w:type="gramEnd"/>
             <w:r>
@@ -8109,14 +8042,7 @@
                 <w:sz w:val="18"/>
                 <w:szCs w:val="18"/>
               </w:rPr>
-              <w:t xml:space="preserve"> exato de cada</w:t>
-            </w:r>
-            <w:r>
-              <w:rPr>
-                <w:sz w:val="18"/>
-                <w:szCs w:val="18"/>
-              </w:rPr>
-              <w:t xml:space="preserve"> </w:t>
+              <w:t xml:space="preserve"> exato de cada </w:t>
             </w:r>
             <w:proofErr w:type="spellStart"/>
             <w:r>
@@ -8251,14 +8177,7 @@
                 <w:sz w:val="18"/>
                 <w:szCs w:val="18"/>
               </w:rPr>
-              <w:t>Sempre navegue clic</w:t>
-            </w:r>
-            <w:r>
-              <w:rPr>
-                <w:sz w:val="18"/>
-                <w:szCs w:val="18"/>
-              </w:rPr>
-              <w:t xml:space="preserve">ando nos elementos — </w:t>
+              <w:t xml:space="preserve">Sempre navegue clicando nos elementos — </w:t>
             </w:r>
             <w:proofErr w:type="spellStart"/>
             <w:r>
@@ -10613,16 +10532,7 @@
                 <w:sz w:val="18"/>
                 <w:szCs w:val="18"/>
               </w:rPr>
-              <w:t xml:space="preserve"> = 'XX0</w:t>
-            </w:r>
-            <w:r>
-              <w:rPr>
-                <w:rFonts w:ascii="Courier New" w:eastAsia="Courier New" w:hAnsi="Courier New" w:cs="Courier New"/>
-                <w:color w:val="D4D4D4"/>
-                <w:sz w:val="18"/>
-                <w:szCs w:val="18"/>
-              </w:rPr>
-              <w:t>1'</w:t>
+              <w:t xml:space="preserve"> = 'XX01'</w:t>
             </w:r>
           </w:p>
           <w:p>
@@ -10951,16 +10861,7 @@
                 <w:sz w:val="18"/>
                 <w:szCs w:val="18"/>
               </w:rPr>
-              <w:t>first.clic</w:t>
-            </w:r>
-            <w:r>
-              <w:rPr>
-                <w:rFonts w:ascii="Courier New" w:eastAsia="Courier New" w:hAnsi="Courier New" w:cs="Courier New"/>
-                <w:color w:val="D4D4D4"/>
-                <w:sz w:val="18"/>
-                <w:szCs w:val="18"/>
-              </w:rPr>
-              <w:t>k</w:t>
+              <w:t>first.click</w:t>
             </w:r>
             <w:proofErr w:type="spellEnd"/>
             <w:r>
@@ -11319,16 +11220,7 @@
                 <w:sz w:val="18"/>
                 <w:szCs w:val="18"/>
               </w:rPr>
-              <w:t>step_i</w:t>
-            </w:r>
-            <w:r>
-              <w:rPr>
-                <w:rFonts w:ascii="Courier New" w:eastAsia="Courier New" w:hAnsi="Courier New" w:cs="Courier New"/>
-                <w:color w:val="D4D4D4"/>
-                <w:sz w:val="18"/>
-                <w:szCs w:val="18"/>
-              </w:rPr>
-              <w:t>d</w:t>
+              <w:t>step_id</w:t>
             </w:r>
             <w:proofErr w:type="spellEnd"/>
             <w:r>
@@ -11661,16 +11553,7 @@
                 <w:sz w:val="18"/>
                 <w:szCs w:val="18"/>
               </w:rPr>
-              <w:t xml:space="preserve">                     </w:t>
-            </w:r>
-            <w:r>
-              <w:rPr>
-                <w:rFonts w:ascii="Courier New" w:eastAsia="Courier New" w:hAnsi="Courier New" w:cs="Courier New"/>
-                <w:color w:val="D4D4D4"/>
-                <w:sz w:val="18"/>
-                <w:szCs w:val="18"/>
-              </w:rPr>
-              <w:t xml:space="preserve">         </w:t>
+              <w:t xml:space="preserve">                              </w:t>
             </w:r>
             <w:proofErr w:type="spellStart"/>
             <w:proofErr w:type="gramStart"/>
@@ -13393,16 +13276,7 @@
                 <w:sz w:val="18"/>
                 <w:szCs w:val="18"/>
               </w:rPr>
-              <w:t xml:space="preserve">     </w:t>
-            </w:r>
-            <w:r>
-              <w:rPr>
-                <w:rFonts w:ascii="Courier New" w:eastAsia="Courier New" w:hAnsi="Courier New" w:cs="Courier New"/>
-                <w:color w:val="D4D4D4"/>
-                <w:sz w:val="18"/>
-                <w:szCs w:val="18"/>
-              </w:rPr>
-              <w:t xml:space="preserve">   </w:t>
+              <w:t xml:space="preserve">        </w:t>
             </w:r>
             <w:proofErr w:type="spellStart"/>
             <w:proofErr w:type="gramStart"/>
@@ -14175,8 +14049,70 @@
                 <w:sz w:val="18"/>
                 <w:szCs w:val="18"/>
               </w:rPr>
-              <w:t>.log_step_</w:t>
-            </w:r>
+              <w:t>.log_step_start</w:t>
+            </w:r>
+            <w:proofErr w:type="spellEnd"/>
+            <w:r>
+              <w:rPr>
+                <w:rFonts w:ascii="Courier New" w:eastAsia="Courier New" w:hAnsi="Courier New" w:cs="Courier New"/>
+                <w:color w:val="D4D4D4"/>
+                <w:sz w:val="18"/>
+                <w:szCs w:val="18"/>
+              </w:rPr>
+              <w:t>(</w:t>
+            </w:r>
+            <w:proofErr w:type="spellStart"/>
+            <w:r>
+              <w:rPr>
+                <w:rFonts w:ascii="Courier New" w:eastAsia="Courier New" w:hAnsi="Courier New" w:cs="Courier New"/>
+                <w:color w:val="D4D4D4"/>
+                <w:sz w:val="18"/>
+                <w:szCs w:val="18"/>
+              </w:rPr>
+              <w:t>step_id</w:t>
+            </w:r>
+            <w:proofErr w:type="spellEnd"/>
+            <w:r>
+              <w:rPr>
+                <w:rFonts w:ascii="Courier New" w:eastAsia="Courier New" w:hAnsi="Courier New" w:cs="Courier New"/>
+                <w:color w:val="D4D4D4"/>
+                <w:sz w:val="18"/>
+                <w:szCs w:val="18"/>
+              </w:rPr>
+              <w:t xml:space="preserve">, 'descrição do que o </w:t>
+            </w:r>
+            <w:proofErr w:type="spellStart"/>
+            <w:r>
+              <w:rPr>
+                <w:rFonts w:ascii="Courier New" w:eastAsia="Courier New" w:hAnsi="Courier New" w:cs="Courier New"/>
+                <w:color w:val="D4D4D4"/>
+                <w:sz w:val="18"/>
+                <w:szCs w:val="18"/>
+              </w:rPr>
+              <w:t>step</w:t>
+            </w:r>
+            <w:proofErr w:type="spellEnd"/>
+            <w:r>
+              <w:rPr>
+                <w:rFonts w:ascii="Courier New" w:eastAsia="Courier New" w:hAnsi="Courier New" w:cs="Courier New"/>
+                <w:color w:val="D4D4D4"/>
+                <w:sz w:val="18"/>
+                <w:szCs w:val="18"/>
+              </w:rPr>
+              <w:t xml:space="preserve"> faz')</w:t>
+            </w:r>
+          </w:p>
+          <w:p>
+            <w:r>
+              <w:rPr>
+                <w:rFonts w:ascii="Courier New" w:eastAsia="Courier New" w:hAnsi="Courier New" w:cs="Courier New"/>
+                <w:color w:val="D4D4D4"/>
+                <w:sz w:val="18"/>
+                <w:szCs w:val="18"/>
+              </w:rPr>
+              <w:t xml:space="preserve">    </w:t>
+            </w:r>
+            <w:proofErr w:type="gramStart"/>
             <w:r>
               <w:rPr>
                 <w:rFonts w:ascii="Courier New" w:eastAsia="Courier New" w:hAnsi="Courier New" w:cs="Courier New"/>
@@ -14186,6 +14122,413 @@
               </w:rPr>
               <w:t>start</w:t>
             </w:r>
+            <w:proofErr w:type="gramEnd"/>
+            <w:r>
+              <w:rPr>
+                <w:rFonts w:ascii="Courier New" w:eastAsia="Courier New" w:hAnsi="Courier New" w:cs="Courier New"/>
+                <w:color w:val="D4D4D4"/>
+                <w:sz w:val="18"/>
+                <w:szCs w:val="18"/>
+              </w:rPr>
+              <w:t xml:space="preserve"> = </w:t>
+            </w:r>
+            <w:proofErr w:type="spellStart"/>
+            <w:r>
+              <w:rPr>
+                <w:rFonts w:ascii="Courier New" w:eastAsia="Courier New" w:hAnsi="Courier New" w:cs="Courier New"/>
+                <w:color w:val="D4D4D4"/>
+                <w:sz w:val="18"/>
+                <w:szCs w:val="18"/>
+              </w:rPr>
+              <w:t>time.monotonic</w:t>
+            </w:r>
+            <w:proofErr w:type="spellEnd"/>
+            <w:r>
+              <w:rPr>
+                <w:rFonts w:ascii="Courier New" w:eastAsia="Courier New" w:hAnsi="Courier New" w:cs="Courier New"/>
+                <w:color w:val="D4D4D4"/>
+                <w:sz w:val="18"/>
+                <w:szCs w:val="18"/>
+              </w:rPr>
+              <w:t>()</w:t>
+            </w:r>
+          </w:p>
+          <w:p>
+            <w:r>
+              <w:rPr>
+                <w:rFonts w:ascii="Courier New" w:eastAsia="Courier New" w:hAnsi="Courier New" w:cs="Courier New"/>
+                <w:color w:val="D4D4D4"/>
+                <w:sz w:val="18"/>
+                <w:szCs w:val="18"/>
+              </w:rPr>
+              <w:t xml:space="preserve">    </w:t>
+            </w:r>
+            <w:proofErr w:type="spellStart"/>
+            <w:proofErr w:type="gramStart"/>
+            <w:r>
+              <w:rPr>
+                <w:rFonts w:ascii="Courier New" w:eastAsia="Courier New" w:hAnsi="Courier New" w:cs="Courier New"/>
+                <w:color w:val="D4D4D4"/>
+                <w:sz w:val="18"/>
+                <w:szCs w:val="18"/>
+              </w:rPr>
+              <w:t>try</w:t>
+            </w:r>
+            <w:proofErr w:type="spellEnd"/>
+            <w:proofErr w:type="gramEnd"/>
+            <w:r>
+              <w:rPr>
+                <w:rFonts w:ascii="Courier New" w:eastAsia="Courier New" w:hAnsi="Courier New" w:cs="Courier New"/>
+                <w:color w:val="D4D4D4"/>
+                <w:sz w:val="18"/>
+                <w:szCs w:val="18"/>
+              </w:rPr>
+              <w:t>:</w:t>
+            </w:r>
+          </w:p>
+          <w:p>
+            <w:r>
+              <w:rPr>
+                <w:rFonts w:ascii="Courier New" w:eastAsia="Courier New" w:hAnsi="Courier New" w:cs="Courier New"/>
+                <w:color w:val="D4D4D4"/>
+                <w:sz w:val="18"/>
+                <w:szCs w:val="18"/>
+              </w:rPr>
+              <w:t xml:space="preserve">        # ── sua ação aqui ──────────────────────────────────</w:t>
+            </w:r>
+          </w:p>
+          <w:p>
+            <w:r>
+              <w:rPr>
+                <w:rFonts w:ascii="Courier New" w:eastAsia="Courier New" w:hAnsi="Courier New" w:cs="Courier New"/>
+                <w:color w:val="D4D4D4"/>
+                <w:sz w:val="18"/>
+                <w:szCs w:val="18"/>
+              </w:rPr>
+              <w:t xml:space="preserve">        </w:t>
+            </w:r>
+            <w:proofErr w:type="spellStart"/>
+            <w:proofErr w:type="gramStart"/>
+            <w:r>
+              <w:rPr>
+                <w:rFonts w:ascii="Courier New" w:eastAsia="Courier New" w:hAnsi="Courier New" w:cs="Courier New"/>
+                <w:color w:val="D4D4D4"/>
+                <w:sz w:val="18"/>
+                <w:szCs w:val="18"/>
+              </w:rPr>
+              <w:t>ctx</w:t>
+            </w:r>
+            <w:proofErr w:type="gramEnd"/>
+            <w:r>
+              <w:rPr>
+                <w:rFonts w:ascii="Courier New" w:eastAsia="Courier New" w:hAnsi="Courier New" w:cs="Courier New"/>
+                <w:color w:val="D4D4D4"/>
+                <w:sz w:val="18"/>
+                <w:szCs w:val="18"/>
+              </w:rPr>
+              <w:t>.runner.safe_click</w:t>
+            </w:r>
+            <w:proofErr w:type="spellEnd"/>
+            <w:r>
+              <w:rPr>
+                <w:rFonts w:ascii="Courier New" w:eastAsia="Courier New" w:hAnsi="Courier New" w:cs="Courier New"/>
+                <w:color w:val="D4D4D4"/>
+                <w:sz w:val="18"/>
+                <w:szCs w:val="18"/>
+              </w:rPr>
+              <w:t>('</w:t>
+            </w:r>
+            <w:proofErr w:type="spellStart"/>
+            <w:r>
+              <w:rPr>
+                <w:rFonts w:ascii="Courier New" w:eastAsia="Courier New" w:hAnsi="Courier New" w:cs="Courier New"/>
+                <w:color w:val="D4D4D4"/>
+                <w:sz w:val="18"/>
+                <w:szCs w:val="18"/>
+              </w:rPr>
+              <w:t>templates</w:t>
+            </w:r>
+            <w:proofErr w:type="spellEnd"/>
+            <w:r>
+              <w:rPr>
+                <w:rFonts w:ascii="Courier New" w:eastAsia="Courier New" w:hAnsi="Courier New" w:cs="Courier New"/>
+                <w:color w:val="D4D4D4"/>
+                <w:sz w:val="18"/>
+                <w:szCs w:val="18"/>
+              </w:rPr>
+              <w:t>/sistema/tela/elemento.png')  # desktop</w:t>
+            </w:r>
+          </w:p>
+          <w:p>
+            <w:r>
+              <w:rPr>
+                <w:rFonts w:ascii="Courier New" w:eastAsia="Courier New" w:hAnsi="Courier New" w:cs="Courier New"/>
+                <w:color w:val="D4D4D4"/>
+                <w:sz w:val="18"/>
+                <w:szCs w:val="18"/>
+              </w:rPr>
+              <w:t xml:space="preserve">        </w:t>
+            </w:r>
+            <w:proofErr w:type="spellStart"/>
+            <w:proofErr w:type="gramStart"/>
+            <w:r>
+              <w:rPr>
+                <w:rFonts w:ascii="Courier New" w:eastAsia="Courier New" w:hAnsi="Courier New" w:cs="Courier New"/>
+                <w:color w:val="D4D4D4"/>
+                <w:sz w:val="18"/>
+                <w:szCs w:val="18"/>
+              </w:rPr>
+              <w:t>ctx</w:t>
+            </w:r>
+            <w:proofErr w:type="gramEnd"/>
+            <w:r>
+              <w:rPr>
+                <w:rFonts w:ascii="Courier New" w:eastAsia="Courier New" w:hAnsi="Courier New" w:cs="Courier New"/>
+                <w:color w:val="D4D4D4"/>
+                <w:sz w:val="18"/>
+                <w:szCs w:val="18"/>
+              </w:rPr>
+              <w:t>.runner.type_text</w:t>
+            </w:r>
+            <w:proofErr w:type="spellEnd"/>
+            <w:r>
+              <w:rPr>
+                <w:rFonts w:ascii="Courier New" w:eastAsia="Courier New" w:hAnsi="Courier New" w:cs="Courier New"/>
+                <w:color w:val="D4D4D4"/>
+                <w:sz w:val="18"/>
+                <w:szCs w:val="18"/>
+              </w:rPr>
+              <w:t>('valor')          # digita (suporta acentos)</w:t>
+            </w:r>
+          </w:p>
+          <w:p>
+            <w:r>
+              <w:rPr>
+                <w:rFonts w:ascii="Courier New" w:eastAsia="Courier New" w:hAnsi="Courier New" w:cs="Courier New"/>
+                <w:color w:val="D4D4D4"/>
+                <w:sz w:val="18"/>
+                <w:szCs w:val="18"/>
+              </w:rPr>
+              <w:t xml:space="preserve">        # </w:t>
+            </w:r>
+            <w:proofErr w:type="spellStart"/>
+            <w:proofErr w:type="gramStart"/>
+            <w:r>
+              <w:rPr>
+                <w:rFonts w:ascii="Courier New" w:eastAsia="Courier New" w:hAnsi="Courier New" w:cs="Courier New"/>
+                <w:color w:val="D4D4D4"/>
+                <w:sz w:val="18"/>
+                <w:szCs w:val="18"/>
+              </w:rPr>
+              <w:t>ctx.</w:t>
+            </w:r>
+            <w:proofErr w:type="gramEnd"/>
+            <w:r>
+              <w:rPr>
+                <w:rFonts w:ascii="Courier New" w:eastAsia="Courier New" w:hAnsi="Courier New" w:cs="Courier New"/>
+                <w:color w:val="D4D4D4"/>
+                <w:sz w:val="18"/>
+                <w:szCs w:val="18"/>
+              </w:rPr>
+              <w:t>runner.fill</w:t>
+            </w:r>
+            <w:proofErr w:type="spellEnd"/>
+            <w:r>
+              <w:rPr>
+                <w:rFonts w:ascii="Courier New" w:eastAsia="Courier New" w:hAnsi="Courier New" w:cs="Courier New"/>
+                <w:color w:val="D4D4D4"/>
+                <w:sz w:val="18"/>
+                <w:szCs w:val="18"/>
+              </w:rPr>
+              <w:t xml:space="preserve">('#seletor', 'valor') # web — </w:t>
+            </w:r>
+            <w:proofErr w:type="spellStart"/>
+            <w:r>
+              <w:rPr>
+                <w:rFonts w:ascii="Courier New" w:eastAsia="Courier New" w:hAnsi="Courier New" w:cs="Courier New"/>
+                <w:color w:val="D4D4D4"/>
+                <w:sz w:val="18"/>
+                <w:szCs w:val="18"/>
+              </w:rPr>
+              <w:t>fill</w:t>
+            </w:r>
+            <w:proofErr w:type="spellEnd"/>
+            <w:r>
+              <w:rPr>
+                <w:rFonts w:ascii="Courier New" w:eastAsia="Courier New" w:hAnsi="Courier New" w:cs="Courier New"/>
+                <w:color w:val="D4D4D4"/>
+                <w:sz w:val="18"/>
+                <w:szCs w:val="18"/>
+              </w:rPr>
+              <w:t xml:space="preserve"> é mais confiável</w:t>
+            </w:r>
+          </w:p>
+          <w:p>
+            <w:r>
+              <w:rPr>
+                <w:rFonts w:ascii="Courier New" w:eastAsia="Courier New" w:hAnsi="Courier New" w:cs="Courier New"/>
+                <w:color w:val="D4D4D4"/>
+                <w:sz w:val="18"/>
+                <w:szCs w:val="18"/>
+              </w:rPr>
+              <w:t xml:space="preserve">        # ───────────────────────────────────────────────────</w:t>
+            </w:r>
+          </w:p>
+          <w:p>
+            <w:r>
+              <w:rPr>
+                <w:rFonts w:ascii="Courier New" w:eastAsia="Courier New" w:hAnsi="Courier New" w:cs="Courier New"/>
+                <w:color w:val="D4D4D4"/>
+                <w:sz w:val="18"/>
+                <w:szCs w:val="18"/>
+              </w:rPr>
+              <w:t xml:space="preserve">        </w:t>
+            </w:r>
+            <w:proofErr w:type="spellStart"/>
+            <w:proofErr w:type="gramStart"/>
+            <w:r>
+              <w:rPr>
+                <w:rFonts w:ascii="Courier New" w:eastAsia="Courier New" w:hAnsi="Courier New" w:cs="Courier New"/>
+                <w:color w:val="D4D4D4"/>
+                <w:sz w:val="18"/>
+                <w:szCs w:val="18"/>
+              </w:rPr>
+              <w:t>screenshot</w:t>
+            </w:r>
+            <w:proofErr w:type="spellEnd"/>
+            <w:proofErr w:type="gramEnd"/>
+            <w:r>
+              <w:rPr>
+                <w:rFonts w:ascii="Courier New" w:eastAsia="Courier New" w:hAnsi="Courier New" w:cs="Courier New"/>
+                <w:color w:val="D4D4D4"/>
+                <w:sz w:val="18"/>
+                <w:szCs w:val="18"/>
+              </w:rPr>
+              <w:t xml:space="preserve"> = </w:t>
+            </w:r>
+            <w:proofErr w:type="spellStart"/>
+            <w:r>
+              <w:rPr>
+                <w:rFonts w:ascii="Courier New" w:eastAsia="Courier New" w:hAnsi="Courier New" w:cs="Courier New"/>
+                <w:color w:val="D4D4D4"/>
+                <w:sz w:val="18"/>
+                <w:szCs w:val="18"/>
+              </w:rPr>
+              <w:t>ctx.runner.screenshot</w:t>
+            </w:r>
+            <w:proofErr w:type="spellEnd"/>
+            <w:r>
+              <w:rPr>
+                <w:rFonts w:ascii="Courier New" w:eastAsia="Courier New" w:hAnsi="Courier New" w:cs="Courier New"/>
+                <w:color w:val="D4D4D4"/>
+                <w:sz w:val="18"/>
+                <w:szCs w:val="18"/>
+              </w:rPr>
+              <w:t>(f'{</w:t>
+            </w:r>
+            <w:proofErr w:type="spellStart"/>
+            <w:r>
+              <w:rPr>
+                <w:rFonts w:ascii="Courier New" w:eastAsia="Courier New" w:hAnsi="Courier New" w:cs="Courier New"/>
+                <w:color w:val="D4D4D4"/>
+                <w:sz w:val="18"/>
+                <w:szCs w:val="18"/>
+              </w:rPr>
+              <w:t>ctx.evidence_dir</w:t>
+            </w:r>
+            <w:proofErr w:type="spellEnd"/>
+            <w:r>
+              <w:rPr>
+                <w:rFonts w:ascii="Courier New" w:eastAsia="Courier New" w:hAnsi="Courier New" w:cs="Courier New"/>
+                <w:color w:val="D4D4D4"/>
+                <w:sz w:val="18"/>
+                <w:szCs w:val="18"/>
+              </w:rPr>
+              <w:t>}{</w:t>
+            </w:r>
+            <w:proofErr w:type="spellStart"/>
+            <w:r>
+              <w:rPr>
+                <w:rFonts w:ascii="Courier New" w:eastAsia="Courier New" w:hAnsi="Courier New" w:cs="Courier New"/>
+                <w:color w:val="D4D4D4"/>
+                <w:sz w:val="18"/>
+                <w:szCs w:val="18"/>
+              </w:rPr>
+              <w:t>step_id</w:t>
+            </w:r>
+            <w:proofErr w:type="spellEnd"/>
+            <w:r>
+              <w:rPr>
+                <w:rFonts w:ascii="Courier New" w:eastAsia="Courier New" w:hAnsi="Courier New" w:cs="Courier New"/>
+                <w:color w:val="D4D4D4"/>
+                <w:sz w:val="18"/>
+                <w:szCs w:val="18"/>
+              </w:rPr>
+              <w:t>}.</w:t>
+            </w:r>
+            <w:proofErr w:type="spellStart"/>
+            <w:r>
+              <w:rPr>
+                <w:rFonts w:ascii="Courier New" w:eastAsia="Courier New" w:hAnsi="Courier New" w:cs="Courier New"/>
+                <w:color w:val="D4D4D4"/>
+                <w:sz w:val="18"/>
+                <w:szCs w:val="18"/>
+              </w:rPr>
+              <w:t>png</w:t>
+            </w:r>
+            <w:proofErr w:type="spellEnd"/>
+            <w:r>
+              <w:rPr>
+                <w:rFonts w:ascii="Courier New" w:eastAsia="Courier New" w:hAnsi="Courier New" w:cs="Courier New"/>
+                <w:color w:val="D4D4D4"/>
+                <w:sz w:val="18"/>
+                <w:szCs w:val="18"/>
+              </w:rPr>
+              <w:t>')</w:t>
+            </w:r>
+          </w:p>
+          <w:p>
+            <w:r>
+              <w:rPr>
+                <w:rFonts w:ascii="Courier New" w:eastAsia="Courier New" w:hAnsi="Courier New" w:cs="Courier New"/>
+                <w:color w:val="D4D4D4"/>
+                <w:sz w:val="18"/>
+                <w:szCs w:val="18"/>
+              </w:rPr>
+              <w:t xml:space="preserve">        </w:t>
+            </w:r>
+            <w:proofErr w:type="spellStart"/>
+            <w:proofErr w:type="gramStart"/>
+            <w:r>
+              <w:rPr>
+                <w:rFonts w:ascii="Courier New" w:eastAsia="Courier New" w:hAnsi="Courier New" w:cs="Courier New"/>
+                <w:color w:val="D4D4D4"/>
+                <w:sz w:val="18"/>
+                <w:szCs w:val="18"/>
+              </w:rPr>
+              <w:t>step</w:t>
+            </w:r>
+            <w:proofErr w:type="spellEnd"/>
+            <w:proofErr w:type="gramEnd"/>
+            <w:r>
+              <w:rPr>
+                <w:rFonts w:ascii="Courier New" w:eastAsia="Courier New" w:hAnsi="Courier New" w:cs="Courier New"/>
+                <w:color w:val="D4D4D4"/>
+                <w:sz w:val="18"/>
+                <w:szCs w:val="18"/>
+              </w:rPr>
+              <w:t xml:space="preserve"> = </w:t>
+            </w:r>
+            <w:proofErr w:type="spellStart"/>
+            <w:r>
+              <w:rPr>
+                <w:rFonts w:ascii="Courier New" w:eastAsia="Courier New" w:hAnsi="Courier New" w:cs="Courier New"/>
+                <w:color w:val="D4D4D4"/>
+                <w:sz w:val="18"/>
+                <w:szCs w:val="18"/>
+              </w:rPr>
+              <w:t>StepResult</w:t>
+            </w:r>
             <w:proofErr w:type="spellEnd"/>
             <w:r>
               <w:rPr>
@@ -14214,9 +14557,240 @@
                 <w:sz w:val="18"/>
                 <w:szCs w:val="18"/>
               </w:rPr>
-              <w:t xml:space="preserve">, 'descrição do que o </w:t>
-            </w:r>
-            <w:proofErr w:type="spellStart"/>
+              <w:t>=</w:t>
+            </w:r>
+            <w:proofErr w:type="spellStart"/>
+            <w:r>
+              <w:rPr>
+                <w:rFonts w:ascii="Courier New" w:eastAsia="Courier New" w:hAnsi="Courier New" w:cs="Courier New"/>
+                <w:color w:val="D4D4D4"/>
+                <w:sz w:val="18"/>
+                <w:szCs w:val="18"/>
+              </w:rPr>
+              <w:t>step_id</w:t>
+            </w:r>
+            <w:proofErr w:type="spellEnd"/>
+            <w:r>
+              <w:rPr>
+                <w:rFonts w:ascii="Courier New" w:eastAsia="Courier New" w:hAnsi="Courier New" w:cs="Courier New"/>
+                <w:color w:val="D4D4D4"/>
+                <w:sz w:val="18"/>
+                <w:szCs w:val="18"/>
+              </w:rPr>
+              <w:t xml:space="preserve">, </w:t>
+            </w:r>
+            <w:proofErr w:type="spellStart"/>
+            <w:r>
+              <w:rPr>
+                <w:rFonts w:ascii="Courier New" w:eastAsia="Courier New" w:hAnsi="Courier New" w:cs="Courier New"/>
+                <w:color w:val="D4D4D4"/>
+                <w:sz w:val="18"/>
+                <w:szCs w:val="18"/>
+              </w:rPr>
+              <w:t>success</w:t>
+            </w:r>
+            <w:proofErr w:type="spellEnd"/>
+            <w:r>
+              <w:rPr>
+                <w:rFonts w:ascii="Courier New" w:eastAsia="Courier New" w:hAnsi="Courier New" w:cs="Courier New"/>
+                <w:color w:val="D4D4D4"/>
+                <w:sz w:val="18"/>
+                <w:szCs w:val="18"/>
+              </w:rPr>
+              <w:t>=</w:t>
+            </w:r>
+            <w:proofErr w:type="spellStart"/>
+            <w:r>
+              <w:rPr>
+                <w:rFonts w:ascii="Courier New" w:eastAsia="Courier New" w:hAnsi="Courier New" w:cs="Courier New"/>
+                <w:color w:val="D4D4D4"/>
+                <w:sz w:val="18"/>
+                <w:szCs w:val="18"/>
+              </w:rPr>
+              <w:t>True</w:t>
+            </w:r>
+            <w:proofErr w:type="spellEnd"/>
+            <w:r>
+              <w:rPr>
+                <w:rFonts w:ascii="Courier New" w:eastAsia="Courier New" w:hAnsi="Courier New" w:cs="Courier New"/>
+                <w:color w:val="D4D4D4"/>
+                <w:sz w:val="18"/>
+                <w:szCs w:val="18"/>
+              </w:rPr>
+              <w:t>,</w:t>
+            </w:r>
+          </w:p>
+          <w:p>
+            <w:r>
+              <w:rPr>
+                <w:rFonts w:ascii="Courier New" w:eastAsia="Courier New" w:hAnsi="Courier New" w:cs="Courier New"/>
+                <w:color w:val="D4D4D4"/>
+                <w:sz w:val="18"/>
+                <w:szCs w:val="18"/>
+              </w:rPr>
+              <w:t xml:space="preserve">                          </w:t>
+            </w:r>
+            <w:proofErr w:type="spellStart"/>
+            <w:proofErr w:type="gramStart"/>
+            <w:r>
+              <w:rPr>
+                <w:rFonts w:ascii="Courier New" w:eastAsia="Courier New" w:hAnsi="Courier New" w:cs="Courier New"/>
+                <w:color w:val="D4D4D4"/>
+                <w:sz w:val="18"/>
+                <w:szCs w:val="18"/>
+              </w:rPr>
+              <w:t>duration_ms</w:t>
+            </w:r>
+            <w:proofErr w:type="spellEnd"/>
+            <w:proofErr w:type="gramEnd"/>
+            <w:r>
+              <w:rPr>
+                <w:rFonts w:ascii="Courier New" w:eastAsia="Courier New" w:hAnsi="Courier New" w:cs="Courier New"/>
+                <w:color w:val="D4D4D4"/>
+                <w:sz w:val="18"/>
+                <w:szCs w:val="18"/>
+              </w:rPr>
+              <w:t>=(</w:t>
+            </w:r>
+            <w:proofErr w:type="spellStart"/>
+            <w:r>
+              <w:rPr>
+                <w:rFonts w:ascii="Courier New" w:eastAsia="Courier New" w:hAnsi="Courier New" w:cs="Courier New"/>
+                <w:color w:val="D4D4D4"/>
+                <w:sz w:val="18"/>
+                <w:szCs w:val="18"/>
+              </w:rPr>
+              <w:t>time.monotonic</w:t>
+            </w:r>
+            <w:proofErr w:type="spellEnd"/>
+            <w:r>
+              <w:rPr>
+                <w:rFonts w:ascii="Courier New" w:eastAsia="Courier New" w:hAnsi="Courier New" w:cs="Courier New"/>
+                <w:color w:val="D4D4D4"/>
+                <w:sz w:val="18"/>
+                <w:szCs w:val="18"/>
+              </w:rPr>
+              <w:t>() - start) * 1000,</w:t>
+            </w:r>
+          </w:p>
+          <w:p>
+            <w:r>
+              <w:rPr>
+                <w:rFonts w:ascii="Courier New" w:eastAsia="Courier New" w:hAnsi="Courier New" w:cs="Courier New"/>
+                <w:color w:val="D4D4D4"/>
+                <w:sz w:val="18"/>
+                <w:szCs w:val="18"/>
+              </w:rPr>
+              <w:t xml:space="preserve">                          </w:t>
+            </w:r>
+            <w:proofErr w:type="spellStart"/>
+            <w:proofErr w:type="gramStart"/>
+            <w:r>
+              <w:rPr>
+                <w:rFonts w:ascii="Courier New" w:eastAsia="Courier New" w:hAnsi="Courier New" w:cs="Courier New"/>
+                <w:color w:val="D4D4D4"/>
+                <w:sz w:val="18"/>
+                <w:szCs w:val="18"/>
+              </w:rPr>
+              <w:t>screenshot_path</w:t>
+            </w:r>
+            <w:proofErr w:type="spellEnd"/>
+            <w:proofErr w:type="gramEnd"/>
+            <w:r>
+              <w:rPr>
+                <w:rFonts w:ascii="Courier New" w:eastAsia="Courier New" w:hAnsi="Courier New" w:cs="Courier New"/>
+                <w:color w:val="D4D4D4"/>
+                <w:sz w:val="18"/>
+                <w:szCs w:val="18"/>
+              </w:rPr>
+              <w:t>=</w:t>
+            </w:r>
+            <w:proofErr w:type="spellStart"/>
+            <w:r>
+              <w:rPr>
+                <w:rFonts w:ascii="Courier New" w:eastAsia="Courier New" w:hAnsi="Courier New" w:cs="Courier New"/>
+                <w:color w:val="D4D4D4"/>
+                <w:sz w:val="18"/>
+                <w:szCs w:val="18"/>
+              </w:rPr>
+              <w:t>screenshot</w:t>
+            </w:r>
+            <w:proofErr w:type="spellEnd"/>
+            <w:r>
+              <w:rPr>
+                <w:rFonts w:ascii="Courier New" w:eastAsia="Courier New" w:hAnsi="Courier New" w:cs="Courier New"/>
+                <w:color w:val="D4D4D4"/>
+                <w:sz w:val="18"/>
+                <w:szCs w:val="18"/>
+              </w:rPr>
+              <w:t>)</w:t>
+            </w:r>
+          </w:p>
+          <w:p>
+            <w:r>
+              <w:rPr>
+                <w:rFonts w:ascii="Courier New" w:eastAsia="Courier New" w:hAnsi="Courier New" w:cs="Courier New"/>
+                <w:color w:val="D4D4D4"/>
+                <w:sz w:val="18"/>
+                <w:szCs w:val="18"/>
+              </w:rPr>
+              <w:t xml:space="preserve">    </w:t>
+            </w:r>
+            <w:proofErr w:type="spellStart"/>
+            <w:proofErr w:type="gramStart"/>
+            <w:r>
+              <w:rPr>
+                <w:rFonts w:ascii="Courier New" w:eastAsia="Courier New" w:hAnsi="Courier New" w:cs="Courier New"/>
+                <w:color w:val="D4D4D4"/>
+                <w:sz w:val="18"/>
+                <w:szCs w:val="18"/>
+              </w:rPr>
+              <w:t>except</w:t>
+            </w:r>
+            <w:proofErr w:type="spellEnd"/>
+            <w:proofErr w:type="gramEnd"/>
+            <w:r>
+              <w:rPr>
+                <w:rFonts w:ascii="Courier New" w:eastAsia="Courier New" w:hAnsi="Courier New" w:cs="Courier New"/>
+                <w:color w:val="D4D4D4"/>
+                <w:sz w:val="18"/>
+                <w:szCs w:val="18"/>
+              </w:rPr>
+              <w:t xml:space="preserve"> </w:t>
+            </w:r>
+            <w:proofErr w:type="spellStart"/>
+            <w:r>
+              <w:rPr>
+                <w:rFonts w:ascii="Courier New" w:eastAsia="Courier New" w:hAnsi="Courier New" w:cs="Courier New"/>
+                <w:color w:val="D4D4D4"/>
+                <w:sz w:val="18"/>
+                <w:szCs w:val="18"/>
+              </w:rPr>
+              <w:t>Exception</w:t>
+            </w:r>
+            <w:proofErr w:type="spellEnd"/>
+            <w:r>
+              <w:rPr>
+                <w:rFonts w:ascii="Courier New" w:eastAsia="Courier New" w:hAnsi="Courier New" w:cs="Courier New"/>
+                <w:color w:val="D4D4D4"/>
+                <w:sz w:val="18"/>
+                <w:szCs w:val="18"/>
+              </w:rPr>
+              <w:t xml:space="preserve"> as e:</w:t>
+            </w:r>
+          </w:p>
+          <w:p>
+            <w:r>
+              <w:rPr>
+                <w:rFonts w:ascii="Courier New" w:eastAsia="Courier New" w:hAnsi="Courier New" w:cs="Courier New"/>
+                <w:color w:val="D4D4D4"/>
+                <w:sz w:val="18"/>
+                <w:szCs w:val="18"/>
+              </w:rPr>
+              <w:t xml:space="preserve">        </w:t>
+            </w:r>
+            <w:proofErr w:type="spellStart"/>
+            <w:proofErr w:type="gramStart"/>
             <w:r>
               <w:rPr>
                 <w:rFonts w:ascii="Courier New" w:eastAsia="Courier New" w:hAnsi="Courier New" w:cs="Courier New"/>
@@ -14227,36 +14801,6 @@
               <w:t>step</w:t>
             </w:r>
             <w:proofErr w:type="spellEnd"/>
-            <w:r>
-              <w:rPr>
-                <w:rFonts w:ascii="Courier New" w:eastAsia="Courier New" w:hAnsi="Courier New" w:cs="Courier New"/>
-                <w:color w:val="D4D4D4"/>
-                <w:sz w:val="18"/>
-                <w:szCs w:val="18"/>
-              </w:rPr>
-              <w:t xml:space="preserve"> faz')</w:t>
-            </w:r>
-          </w:p>
-          <w:p>
-            <w:r>
-              <w:rPr>
-                <w:rFonts w:ascii="Courier New" w:eastAsia="Courier New" w:hAnsi="Courier New" w:cs="Courier New"/>
-                <w:color w:val="D4D4D4"/>
-                <w:sz w:val="18"/>
-                <w:szCs w:val="18"/>
-              </w:rPr>
-              <w:t xml:space="preserve">    </w:t>
-            </w:r>
-            <w:proofErr w:type="gramStart"/>
-            <w:r>
-              <w:rPr>
-                <w:rFonts w:ascii="Courier New" w:eastAsia="Courier New" w:hAnsi="Courier New" w:cs="Courier New"/>
-                <w:color w:val="D4D4D4"/>
-                <w:sz w:val="18"/>
-                <w:szCs w:val="18"/>
-              </w:rPr>
-              <w:t>start</w:t>
-            </w:r>
             <w:proofErr w:type="gramEnd"/>
             <w:r>
               <w:rPr>
@@ -14275,320 +14819,17 @@
                 <w:sz w:val="18"/>
                 <w:szCs w:val="18"/>
               </w:rPr>
-              <w:t>time.monotonic</w:t>
-            </w:r>
-            <w:proofErr w:type="spellEnd"/>
-            <w:r>
-              <w:rPr>
-                <w:rFonts w:ascii="Courier New" w:eastAsia="Courier New" w:hAnsi="Courier New" w:cs="Courier New"/>
-                <w:color w:val="D4D4D4"/>
-                <w:sz w:val="18"/>
-                <w:szCs w:val="18"/>
-              </w:rPr>
-              <w:t>()</w:t>
-            </w:r>
-          </w:p>
-          <w:p>
-            <w:r>
-              <w:rPr>
-                <w:rFonts w:ascii="Courier New" w:eastAsia="Courier New" w:hAnsi="Courier New" w:cs="Courier New"/>
-                <w:color w:val="D4D4D4"/>
-                <w:sz w:val="18"/>
-                <w:szCs w:val="18"/>
-              </w:rPr>
-              <w:t xml:space="preserve">    </w:t>
-            </w:r>
-            <w:proofErr w:type="spellStart"/>
-            <w:proofErr w:type="gramStart"/>
-            <w:r>
-              <w:rPr>
-                <w:rFonts w:ascii="Courier New" w:eastAsia="Courier New" w:hAnsi="Courier New" w:cs="Courier New"/>
-                <w:color w:val="D4D4D4"/>
-                <w:sz w:val="18"/>
-                <w:szCs w:val="18"/>
-              </w:rPr>
-              <w:t>try</w:t>
-            </w:r>
-            <w:proofErr w:type="spellEnd"/>
-            <w:proofErr w:type="gramEnd"/>
-            <w:r>
-              <w:rPr>
-                <w:rFonts w:ascii="Courier New" w:eastAsia="Courier New" w:hAnsi="Courier New" w:cs="Courier New"/>
-                <w:color w:val="D4D4D4"/>
-                <w:sz w:val="18"/>
-                <w:szCs w:val="18"/>
-              </w:rPr>
-              <w:t>:</w:t>
-            </w:r>
-          </w:p>
-          <w:p>
-            <w:r>
-              <w:rPr>
-                <w:rFonts w:ascii="Courier New" w:eastAsia="Courier New" w:hAnsi="Courier New" w:cs="Courier New"/>
-                <w:color w:val="D4D4D4"/>
-                <w:sz w:val="18"/>
-                <w:szCs w:val="18"/>
-              </w:rPr>
-              <w:t xml:space="preserve">        # ── sua ação aqui ──────────────────────────────────</w:t>
-            </w:r>
-          </w:p>
-          <w:p>
-            <w:r>
-              <w:rPr>
-                <w:rFonts w:ascii="Courier New" w:eastAsia="Courier New" w:hAnsi="Courier New" w:cs="Courier New"/>
-                <w:color w:val="D4D4D4"/>
-                <w:sz w:val="18"/>
-                <w:szCs w:val="18"/>
-              </w:rPr>
-              <w:t xml:space="preserve">        </w:t>
-            </w:r>
-            <w:proofErr w:type="spellStart"/>
-            <w:proofErr w:type="gramStart"/>
-            <w:r>
-              <w:rPr>
-                <w:rFonts w:ascii="Courier New" w:eastAsia="Courier New" w:hAnsi="Courier New" w:cs="Courier New"/>
-                <w:color w:val="D4D4D4"/>
-                <w:sz w:val="18"/>
-                <w:szCs w:val="18"/>
-              </w:rPr>
-              <w:t>ctx</w:t>
-            </w:r>
-            <w:proofErr w:type="gramEnd"/>
-            <w:r>
-              <w:rPr>
-                <w:rFonts w:ascii="Courier New" w:eastAsia="Courier New" w:hAnsi="Courier New" w:cs="Courier New"/>
-                <w:color w:val="D4D4D4"/>
-                <w:sz w:val="18"/>
-                <w:szCs w:val="18"/>
-              </w:rPr>
-              <w:t>.runner.safe_click</w:t>
-            </w:r>
-            <w:proofErr w:type="spellEnd"/>
-            <w:r>
-              <w:rPr>
-                <w:rFonts w:ascii="Courier New" w:eastAsia="Courier New" w:hAnsi="Courier New" w:cs="Courier New"/>
-                <w:color w:val="D4D4D4"/>
-                <w:sz w:val="18"/>
-                <w:szCs w:val="18"/>
-              </w:rPr>
-              <w:t>('</w:t>
-            </w:r>
-            <w:proofErr w:type="spellStart"/>
-            <w:r>
-              <w:rPr>
-                <w:rFonts w:ascii="Courier New" w:eastAsia="Courier New" w:hAnsi="Courier New" w:cs="Courier New"/>
-                <w:color w:val="D4D4D4"/>
-                <w:sz w:val="18"/>
-                <w:szCs w:val="18"/>
-              </w:rPr>
-              <w:t>templates</w:t>
-            </w:r>
-            <w:proofErr w:type="spellEnd"/>
-            <w:r>
-              <w:rPr>
-                <w:rFonts w:ascii="Courier New" w:eastAsia="Courier New" w:hAnsi="Courier New" w:cs="Courier New"/>
-                <w:color w:val="D4D4D4"/>
-                <w:sz w:val="18"/>
-                <w:szCs w:val="18"/>
-              </w:rPr>
-              <w:t>/sistema/tela/elemento.png')  # desktop</w:t>
-            </w:r>
-          </w:p>
-          <w:p>
-            <w:r>
-              <w:rPr>
-                <w:rFonts w:ascii="Courier New" w:eastAsia="Courier New" w:hAnsi="Courier New" w:cs="Courier New"/>
-                <w:color w:val="D4D4D4"/>
-                <w:sz w:val="18"/>
-                <w:szCs w:val="18"/>
-              </w:rPr>
-              <w:t xml:space="preserve">        </w:t>
-            </w:r>
-            <w:proofErr w:type="spellStart"/>
-            <w:proofErr w:type="gramStart"/>
-            <w:r>
-              <w:rPr>
-                <w:rFonts w:ascii="Courier New" w:eastAsia="Courier New" w:hAnsi="Courier New" w:cs="Courier New"/>
-                <w:color w:val="D4D4D4"/>
-                <w:sz w:val="18"/>
-                <w:szCs w:val="18"/>
-              </w:rPr>
-              <w:t>ctx</w:t>
-            </w:r>
-            <w:proofErr w:type="gramEnd"/>
-            <w:r>
-              <w:rPr>
-                <w:rFonts w:ascii="Courier New" w:eastAsia="Courier New" w:hAnsi="Courier New" w:cs="Courier New"/>
-                <w:color w:val="D4D4D4"/>
-                <w:sz w:val="18"/>
-                <w:szCs w:val="18"/>
-              </w:rPr>
-              <w:t>.runner.type_text</w:t>
-            </w:r>
-            <w:proofErr w:type="spellEnd"/>
-            <w:r>
-              <w:rPr>
-                <w:rFonts w:ascii="Courier New" w:eastAsia="Courier New" w:hAnsi="Courier New" w:cs="Courier New"/>
-                <w:color w:val="D4D4D4"/>
-                <w:sz w:val="18"/>
-                <w:szCs w:val="18"/>
-              </w:rPr>
-              <w:t>('</w:t>
-            </w:r>
-            <w:r>
-              <w:rPr>
-                <w:rFonts w:ascii="Courier New" w:eastAsia="Courier New" w:hAnsi="Courier New" w:cs="Courier New"/>
-                <w:color w:val="D4D4D4"/>
-                <w:sz w:val="18"/>
-                <w:szCs w:val="18"/>
-              </w:rPr>
-              <w:t>valor')          # digita (suporta acentos)</w:t>
-            </w:r>
-          </w:p>
-          <w:p>
-            <w:r>
-              <w:rPr>
-                <w:rFonts w:ascii="Courier New" w:eastAsia="Courier New" w:hAnsi="Courier New" w:cs="Courier New"/>
-                <w:color w:val="D4D4D4"/>
-                <w:sz w:val="18"/>
-                <w:szCs w:val="18"/>
-              </w:rPr>
-              <w:t xml:space="preserve">        # </w:t>
-            </w:r>
-            <w:proofErr w:type="spellStart"/>
-            <w:proofErr w:type="gramStart"/>
-            <w:r>
-              <w:rPr>
-                <w:rFonts w:ascii="Courier New" w:eastAsia="Courier New" w:hAnsi="Courier New" w:cs="Courier New"/>
-                <w:color w:val="D4D4D4"/>
-                <w:sz w:val="18"/>
-                <w:szCs w:val="18"/>
-              </w:rPr>
-              <w:t>ctx.</w:t>
-            </w:r>
-            <w:proofErr w:type="gramEnd"/>
-            <w:r>
-              <w:rPr>
-                <w:rFonts w:ascii="Courier New" w:eastAsia="Courier New" w:hAnsi="Courier New" w:cs="Courier New"/>
-                <w:color w:val="D4D4D4"/>
-                <w:sz w:val="18"/>
-                <w:szCs w:val="18"/>
-              </w:rPr>
-              <w:t>runner.fill</w:t>
-            </w:r>
-            <w:proofErr w:type="spellEnd"/>
-            <w:r>
-              <w:rPr>
-                <w:rFonts w:ascii="Courier New" w:eastAsia="Courier New" w:hAnsi="Courier New" w:cs="Courier New"/>
-                <w:color w:val="D4D4D4"/>
-                <w:sz w:val="18"/>
-                <w:szCs w:val="18"/>
-              </w:rPr>
-              <w:t xml:space="preserve">('#seletor', 'valor') # web — </w:t>
-            </w:r>
-            <w:proofErr w:type="spellStart"/>
-            <w:r>
-              <w:rPr>
-                <w:rFonts w:ascii="Courier New" w:eastAsia="Courier New" w:hAnsi="Courier New" w:cs="Courier New"/>
-                <w:color w:val="D4D4D4"/>
-                <w:sz w:val="18"/>
-                <w:szCs w:val="18"/>
-              </w:rPr>
-              <w:t>fill</w:t>
-            </w:r>
-            <w:proofErr w:type="spellEnd"/>
-            <w:r>
-              <w:rPr>
-                <w:rFonts w:ascii="Courier New" w:eastAsia="Courier New" w:hAnsi="Courier New" w:cs="Courier New"/>
-                <w:color w:val="D4D4D4"/>
-                <w:sz w:val="18"/>
-                <w:szCs w:val="18"/>
-              </w:rPr>
-              <w:t xml:space="preserve"> é mais confiável</w:t>
-            </w:r>
-          </w:p>
-          <w:p>
-            <w:r>
-              <w:rPr>
-                <w:rFonts w:ascii="Courier New" w:eastAsia="Courier New" w:hAnsi="Courier New" w:cs="Courier New"/>
-                <w:color w:val="D4D4D4"/>
-                <w:sz w:val="18"/>
-                <w:szCs w:val="18"/>
-              </w:rPr>
-              <w:t xml:space="preserve">        # ───────────────────────────────────────────────────</w:t>
-            </w:r>
-          </w:p>
-          <w:p>
-            <w:r>
-              <w:rPr>
-                <w:rFonts w:ascii="Courier New" w:eastAsia="Courier New" w:hAnsi="Courier New" w:cs="Courier New"/>
-                <w:color w:val="D4D4D4"/>
-                <w:sz w:val="18"/>
-                <w:szCs w:val="18"/>
-              </w:rPr>
-              <w:t xml:space="preserve">        </w:t>
-            </w:r>
-            <w:proofErr w:type="spellStart"/>
-            <w:proofErr w:type="gramStart"/>
-            <w:r>
-              <w:rPr>
-                <w:rFonts w:ascii="Courier New" w:eastAsia="Courier New" w:hAnsi="Courier New" w:cs="Courier New"/>
-                <w:color w:val="D4D4D4"/>
-                <w:sz w:val="18"/>
-                <w:szCs w:val="18"/>
-              </w:rPr>
-              <w:t>screenshot</w:t>
-            </w:r>
-            <w:proofErr w:type="spellEnd"/>
-            <w:proofErr w:type="gramEnd"/>
-            <w:r>
-              <w:rPr>
-                <w:rFonts w:ascii="Courier New" w:eastAsia="Courier New" w:hAnsi="Courier New" w:cs="Courier New"/>
-                <w:color w:val="D4D4D4"/>
-                <w:sz w:val="18"/>
-                <w:szCs w:val="18"/>
-              </w:rPr>
-              <w:t xml:space="preserve"> = </w:t>
-            </w:r>
-            <w:proofErr w:type="spellStart"/>
-            <w:r>
-              <w:rPr>
-                <w:rFonts w:ascii="Courier New" w:eastAsia="Courier New" w:hAnsi="Courier New" w:cs="Courier New"/>
-                <w:color w:val="D4D4D4"/>
-                <w:sz w:val="18"/>
-                <w:szCs w:val="18"/>
-              </w:rPr>
-              <w:t>ctx.runner.screenshot</w:t>
-            </w:r>
-            <w:proofErr w:type="spellEnd"/>
-            <w:r>
-              <w:rPr>
-                <w:rFonts w:ascii="Courier New" w:eastAsia="Courier New" w:hAnsi="Courier New" w:cs="Courier New"/>
-                <w:color w:val="D4D4D4"/>
-                <w:sz w:val="18"/>
-                <w:szCs w:val="18"/>
-              </w:rPr>
-              <w:t>(f'{</w:t>
-            </w:r>
-            <w:proofErr w:type="spellStart"/>
-            <w:r>
-              <w:rPr>
-                <w:rFonts w:ascii="Courier New" w:eastAsia="Courier New" w:hAnsi="Courier New" w:cs="Courier New"/>
-                <w:color w:val="D4D4D4"/>
-                <w:sz w:val="18"/>
-                <w:szCs w:val="18"/>
-              </w:rPr>
-              <w:t>ctx.evidence_dir</w:t>
-            </w:r>
-            <w:proofErr w:type="spellEnd"/>
-            <w:r>
-              <w:rPr>
-                <w:rFonts w:ascii="Courier New" w:eastAsia="Courier New" w:hAnsi="Courier New" w:cs="Courier New"/>
-                <w:color w:val="D4D4D4"/>
-                <w:sz w:val="18"/>
-                <w:szCs w:val="18"/>
-              </w:rPr>
-              <w:t>}{</w:t>
+              <w:t>StepResult</w:t>
+            </w:r>
+            <w:proofErr w:type="spellEnd"/>
+            <w:r>
+              <w:rPr>
+                <w:rFonts w:ascii="Courier New" w:eastAsia="Courier New" w:hAnsi="Courier New" w:cs="Courier New"/>
+                <w:color w:val="D4D4D4"/>
+                <w:sz w:val="18"/>
+                <w:szCs w:val="18"/>
+              </w:rPr>
+              <w:t>(</w:t>
             </w:r>
             <w:proofErr w:type="spellStart"/>
             <w:r>
@@ -14608,80 +14849,7 @@
                 <w:sz w:val="18"/>
                 <w:szCs w:val="18"/>
               </w:rPr>
-              <w:t>}.</w:t>
-            </w:r>
-            <w:proofErr w:type="spellStart"/>
-            <w:r>
-              <w:rPr>
-                <w:rFonts w:ascii="Courier New" w:eastAsia="Courier New" w:hAnsi="Courier New" w:cs="Courier New"/>
-                <w:color w:val="D4D4D4"/>
-                <w:sz w:val="18"/>
-                <w:szCs w:val="18"/>
-              </w:rPr>
-              <w:t>png</w:t>
-            </w:r>
-            <w:proofErr w:type="spellEnd"/>
-            <w:r>
-              <w:rPr>
-                <w:rFonts w:ascii="Courier New" w:eastAsia="Courier New" w:hAnsi="Courier New" w:cs="Courier New"/>
-                <w:color w:val="D4D4D4"/>
-                <w:sz w:val="18"/>
-                <w:szCs w:val="18"/>
-              </w:rPr>
-              <w:t>')</w:t>
-            </w:r>
-          </w:p>
-          <w:p>
-            <w:r>
-              <w:rPr>
-                <w:rFonts w:ascii="Courier New" w:eastAsia="Courier New" w:hAnsi="Courier New" w:cs="Courier New"/>
-                <w:color w:val="D4D4D4"/>
-                <w:sz w:val="18"/>
-                <w:szCs w:val="18"/>
-              </w:rPr>
-              <w:t xml:space="preserve">        </w:t>
-            </w:r>
-            <w:proofErr w:type="spellStart"/>
-            <w:proofErr w:type="gramStart"/>
-            <w:r>
-              <w:rPr>
-                <w:rFonts w:ascii="Courier New" w:eastAsia="Courier New" w:hAnsi="Courier New" w:cs="Courier New"/>
-                <w:color w:val="D4D4D4"/>
-                <w:sz w:val="18"/>
-                <w:szCs w:val="18"/>
-              </w:rPr>
-              <w:t>step</w:t>
-            </w:r>
-            <w:proofErr w:type="spellEnd"/>
-            <w:proofErr w:type="gramEnd"/>
-            <w:r>
-              <w:rPr>
-                <w:rFonts w:ascii="Courier New" w:eastAsia="Courier New" w:hAnsi="Courier New" w:cs="Courier New"/>
-                <w:color w:val="D4D4D4"/>
-                <w:sz w:val="18"/>
-                <w:szCs w:val="18"/>
-              </w:rPr>
-              <w:t xml:space="preserve"> = </w:t>
-            </w:r>
-            <w:proofErr w:type="spellStart"/>
-            <w:r>
-              <w:rPr>
-                <w:rFonts w:ascii="Courier New" w:eastAsia="Courier New" w:hAnsi="Courier New" w:cs="Courier New"/>
-                <w:color w:val="D4D4D4"/>
-                <w:sz w:val="18"/>
-                <w:szCs w:val="18"/>
-              </w:rPr>
-              <w:t>StepResult</w:t>
-            </w:r>
-            <w:proofErr w:type="spellEnd"/>
-            <w:r>
-              <w:rPr>
-                <w:rFonts w:ascii="Courier New" w:eastAsia="Courier New" w:hAnsi="Courier New" w:cs="Courier New"/>
-                <w:color w:val="D4D4D4"/>
-                <w:sz w:val="18"/>
-                <w:szCs w:val="18"/>
-              </w:rPr>
-              <w:t>(</w:t>
+              <w:t>=</w:t>
             </w:r>
             <w:proofErr w:type="spellStart"/>
             <w:r>
@@ -14692,327 +14860,6 @@
                 <w:szCs w:val="18"/>
               </w:rPr>
               <w:t>step_id</w:t>
-            </w:r>
-            <w:proofErr w:type="spellEnd"/>
-            <w:r>
-              <w:rPr>
-                <w:rFonts w:ascii="Courier New" w:eastAsia="Courier New" w:hAnsi="Courier New" w:cs="Courier New"/>
-                <w:color w:val="D4D4D4"/>
-                <w:sz w:val="18"/>
-                <w:szCs w:val="18"/>
-              </w:rPr>
-              <w:t>=</w:t>
-            </w:r>
-            <w:proofErr w:type="spellStart"/>
-            <w:r>
-              <w:rPr>
-                <w:rFonts w:ascii="Courier New" w:eastAsia="Courier New" w:hAnsi="Courier New" w:cs="Courier New"/>
-                <w:color w:val="D4D4D4"/>
-                <w:sz w:val="18"/>
-                <w:szCs w:val="18"/>
-              </w:rPr>
-              <w:t>step_id</w:t>
-            </w:r>
-            <w:proofErr w:type="spellEnd"/>
-            <w:r>
-              <w:rPr>
-                <w:rFonts w:ascii="Courier New" w:eastAsia="Courier New" w:hAnsi="Courier New" w:cs="Courier New"/>
-                <w:color w:val="D4D4D4"/>
-                <w:sz w:val="18"/>
-                <w:szCs w:val="18"/>
-              </w:rPr>
-              <w:t xml:space="preserve">, </w:t>
-            </w:r>
-            <w:proofErr w:type="spellStart"/>
-            <w:r>
-              <w:rPr>
-                <w:rFonts w:ascii="Courier New" w:eastAsia="Courier New" w:hAnsi="Courier New" w:cs="Courier New"/>
-                <w:color w:val="D4D4D4"/>
-                <w:sz w:val="18"/>
-                <w:szCs w:val="18"/>
-              </w:rPr>
-              <w:t>success</w:t>
-            </w:r>
-            <w:proofErr w:type="spellEnd"/>
-            <w:r>
-              <w:rPr>
-                <w:rFonts w:ascii="Courier New" w:eastAsia="Courier New" w:hAnsi="Courier New" w:cs="Courier New"/>
-                <w:color w:val="D4D4D4"/>
-                <w:sz w:val="18"/>
-                <w:szCs w:val="18"/>
-              </w:rPr>
-              <w:t>=</w:t>
-            </w:r>
-            <w:proofErr w:type="spellStart"/>
-            <w:r>
-              <w:rPr>
-                <w:rFonts w:ascii="Courier New" w:eastAsia="Courier New" w:hAnsi="Courier New" w:cs="Courier New"/>
-                <w:color w:val="D4D4D4"/>
-                <w:sz w:val="18"/>
-                <w:szCs w:val="18"/>
-              </w:rPr>
-              <w:t>True</w:t>
-            </w:r>
-            <w:proofErr w:type="spellEnd"/>
-            <w:r>
-              <w:rPr>
-                <w:rFonts w:ascii="Courier New" w:eastAsia="Courier New" w:hAnsi="Courier New" w:cs="Courier New"/>
-                <w:color w:val="D4D4D4"/>
-                <w:sz w:val="18"/>
-                <w:szCs w:val="18"/>
-              </w:rPr>
-              <w:t>,</w:t>
-            </w:r>
-          </w:p>
-          <w:p>
-            <w:r>
-              <w:rPr>
-                <w:rFonts w:ascii="Courier New" w:eastAsia="Courier New" w:hAnsi="Courier New" w:cs="Courier New"/>
-                <w:color w:val="D4D4D4"/>
-                <w:sz w:val="18"/>
-                <w:szCs w:val="18"/>
-              </w:rPr>
-              <w:t xml:space="preserve">                          </w:t>
-            </w:r>
-            <w:proofErr w:type="spellStart"/>
-            <w:proofErr w:type="gramStart"/>
-            <w:r>
-              <w:rPr>
-                <w:rFonts w:ascii="Courier New" w:eastAsia="Courier New" w:hAnsi="Courier New" w:cs="Courier New"/>
-                <w:color w:val="D4D4D4"/>
-                <w:sz w:val="18"/>
-                <w:szCs w:val="18"/>
-              </w:rPr>
-              <w:t>duration_ms</w:t>
-            </w:r>
-            <w:proofErr w:type="spellEnd"/>
-            <w:proofErr w:type="gramEnd"/>
-            <w:r>
-              <w:rPr>
-                <w:rFonts w:ascii="Courier New" w:eastAsia="Courier New" w:hAnsi="Courier New" w:cs="Courier New"/>
-                <w:color w:val="D4D4D4"/>
-                <w:sz w:val="18"/>
-                <w:szCs w:val="18"/>
-              </w:rPr>
-              <w:t>=(</w:t>
-            </w:r>
-            <w:proofErr w:type="spellStart"/>
-            <w:r>
-              <w:rPr>
-                <w:rFonts w:ascii="Courier New" w:eastAsia="Courier New" w:hAnsi="Courier New" w:cs="Courier New"/>
-                <w:color w:val="D4D4D4"/>
-                <w:sz w:val="18"/>
-                <w:szCs w:val="18"/>
-              </w:rPr>
-              <w:t>time.monotonic</w:t>
-            </w:r>
-            <w:proofErr w:type="spellEnd"/>
-            <w:r>
-              <w:rPr>
-                <w:rFonts w:ascii="Courier New" w:eastAsia="Courier New" w:hAnsi="Courier New" w:cs="Courier New"/>
-                <w:color w:val="D4D4D4"/>
-                <w:sz w:val="18"/>
-                <w:szCs w:val="18"/>
-              </w:rPr>
-              <w:t>() - start) * 1000,</w:t>
-            </w:r>
-          </w:p>
-          <w:p>
-            <w:r>
-              <w:rPr>
-                <w:rFonts w:ascii="Courier New" w:eastAsia="Courier New" w:hAnsi="Courier New" w:cs="Courier New"/>
-                <w:color w:val="D4D4D4"/>
-                <w:sz w:val="18"/>
-                <w:szCs w:val="18"/>
-              </w:rPr>
-              <w:t xml:space="preserve">                          </w:t>
-            </w:r>
-            <w:proofErr w:type="spellStart"/>
-            <w:proofErr w:type="gramStart"/>
-            <w:r>
-              <w:rPr>
-                <w:rFonts w:ascii="Courier New" w:eastAsia="Courier New" w:hAnsi="Courier New" w:cs="Courier New"/>
-                <w:color w:val="D4D4D4"/>
-                <w:sz w:val="18"/>
-                <w:szCs w:val="18"/>
-              </w:rPr>
-              <w:t>screenshot_path</w:t>
-            </w:r>
-            <w:proofErr w:type="spellEnd"/>
-            <w:proofErr w:type="gramEnd"/>
-            <w:r>
-              <w:rPr>
-                <w:rFonts w:ascii="Courier New" w:eastAsia="Courier New" w:hAnsi="Courier New" w:cs="Courier New"/>
-                <w:color w:val="D4D4D4"/>
-                <w:sz w:val="18"/>
-                <w:szCs w:val="18"/>
-              </w:rPr>
-              <w:t>=</w:t>
-            </w:r>
-            <w:proofErr w:type="spellStart"/>
-            <w:r>
-              <w:rPr>
-                <w:rFonts w:ascii="Courier New" w:eastAsia="Courier New" w:hAnsi="Courier New" w:cs="Courier New"/>
-                <w:color w:val="D4D4D4"/>
-                <w:sz w:val="18"/>
-                <w:szCs w:val="18"/>
-              </w:rPr>
-              <w:t>screenshot</w:t>
-            </w:r>
-            <w:proofErr w:type="spellEnd"/>
-            <w:r>
-              <w:rPr>
-                <w:rFonts w:ascii="Courier New" w:eastAsia="Courier New" w:hAnsi="Courier New" w:cs="Courier New"/>
-                <w:color w:val="D4D4D4"/>
-                <w:sz w:val="18"/>
-                <w:szCs w:val="18"/>
-              </w:rPr>
-              <w:t>)</w:t>
-            </w:r>
-          </w:p>
-          <w:p>
-            <w:r>
-              <w:rPr>
-                <w:rFonts w:ascii="Courier New" w:eastAsia="Courier New" w:hAnsi="Courier New" w:cs="Courier New"/>
-                <w:color w:val="D4D4D4"/>
-                <w:sz w:val="18"/>
-                <w:szCs w:val="18"/>
-              </w:rPr>
-              <w:t xml:space="preserve">    </w:t>
-            </w:r>
-            <w:proofErr w:type="spellStart"/>
-            <w:proofErr w:type="gramStart"/>
-            <w:r>
-              <w:rPr>
-                <w:rFonts w:ascii="Courier New" w:eastAsia="Courier New" w:hAnsi="Courier New" w:cs="Courier New"/>
-                <w:color w:val="D4D4D4"/>
-                <w:sz w:val="18"/>
-                <w:szCs w:val="18"/>
-              </w:rPr>
-              <w:t>except</w:t>
-            </w:r>
-            <w:proofErr w:type="spellEnd"/>
-            <w:proofErr w:type="gramEnd"/>
-            <w:r>
-              <w:rPr>
-                <w:rFonts w:ascii="Courier New" w:eastAsia="Courier New" w:hAnsi="Courier New" w:cs="Courier New"/>
-                <w:color w:val="D4D4D4"/>
-                <w:sz w:val="18"/>
-                <w:szCs w:val="18"/>
-              </w:rPr>
-              <w:t xml:space="preserve"> </w:t>
-            </w:r>
-            <w:proofErr w:type="spellStart"/>
-            <w:r>
-              <w:rPr>
-                <w:rFonts w:ascii="Courier New" w:eastAsia="Courier New" w:hAnsi="Courier New" w:cs="Courier New"/>
-                <w:color w:val="D4D4D4"/>
-                <w:sz w:val="18"/>
-                <w:szCs w:val="18"/>
-              </w:rPr>
-              <w:t>Exception</w:t>
-            </w:r>
-            <w:proofErr w:type="spellEnd"/>
-            <w:r>
-              <w:rPr>
-                <w:rFonts w:ascii="Courier New" w:eastAsia="Courier New" w:hAnsi="Courier New" w:cs="Courier New"/>
-                <w:color w:val="D4D4D4"/>
-                <w:sz w:val="18"/>
-                <w:szCs w:val="18"/>
-              </w:rPr>
-              <w:t xml:space="preserve"> as e:</w:t>
-            </w:r>
-          </w:p>
-          <w:p>
-            <w:r>
-              <w:rPr>
-                <w:rFonts w:ascii="Courier New" w:eastAsia="Courier New" w:hAnsi="Courier New" w:cs="Courier New"/>
-                <w:color w:val="D4D4D4"/>
-                <w:sz w:val="18"/>
-                <w:szCs w:val="18"/>
-              </w:rPr>
-              <w:t xml:space="preserve">        </w:t>
-            </w:r>
-            <w:proofErr w:type="spellStart"/>
-            <w:proofErr w:type="gramStart"/>
-            <w:r>
-              <w:rPr>
-                <w:rFonts w:ascii="Courier New" w:eastAsia="Courier New" w:hAnsi="Courier New" w:cs="Courier New"/>
-                <w:color w:val="D4D4D4"/>
-                <w:sz w:val="18"/>
-                <w:szCs w:val="18"/>
-              </w:rPr>
-              <w:t>step</w:t>
-            </w:r>
-            <w:proofErr w:type="spellEnd"/>
-            <w:proofErr w:type="gramEnd"/>
-            <w:r>
-              <w:rPr>
-                <w:rFonts w:ascii="Courier New" w:eastAsia="Courier New" w:hAnsi="Courier New" w:cs="Courier New"/>
-                <w:color w:val="D4D4D4"/>
-                <w:sz w:val="18"/>
-                <w:szCs w:val="18"/>
-              </w:rPr>
-              <w:t xml:space="preserve"> = </w:t>
-            </w:r>
-            <w:proofErr w:type="spellStart"/>
-            <w:r>
-              <w:rPr>
-                <w:rFonts w:ascii="Courier New" w:eastAsia="Courier New" w:hAnsi="Courier New" w:cs="Courier New"/>
-                <w:color w:val="D4D4D4"/>
-                <w:sz w:val="18"/>
-                <w:szCs w:val="18"/>
-              </w:rPr>
-              <w:t>StepResult</w:t>
-            </w:r>
-            <w:proofErr w:type="spellEnd"/>
-            <w:r>
-              <w:rPr>
-                <w:rFonts w:ascii="Courier New" w:eastAsia="Courier New" w:hAnsi="Courier New" w:cs="Courier New"/>
-                <w:color w:val="D4D4D4"/>
-                <w:sz w:val="18"/>
-                <w:szCs w:val="18"/>
-              </w:rPr>
-              <w:t>(</w:t>
-            </w:r>
-            <w:proofErr w:type="spellStart"/>
-            <w:r>
-              <w:rPr>
-                <w:rFonts w:ascii="Courier New" w:eastAsia="Courier New" w:hAnsi="Courier New" w:cs="Courier New"/>
-                <w:color w:val="D4D4D4"/>
-                <w:sz w:val="18"/>
-                <w:szCs w:val="18"/>
-              </w:rPr>
-              <w:t>step_id</w:t>
-            </w:r>
-            <w:proofErr w:type="spellEnd"/>
-            <w:r>
-              <w:rPr>
-                <w:rFonts w:ascii="Courier New" w:eastAsia="Courier New" w:hAnsi="Courier New" w:cs="Courier New"/>
-                <w:color w:val="D4D4D4"/>
-                <w:sz w:val="18"/>
-                <w:szCs w:val="18"/>
-              </w:rPr>
-              <w:t>=</w:t>
-            </w:r>
-            <w:proofErr w:type="spellStart"/>
-            <w:r>
-              <w:rPr>
-                <w:rFonts w:ascii="Courier New" w:eastAsia="Courier New" w:hAnsi="Courier New" w:cs="Courier New"/>
-                <w:color w:val="D4D4D4"/>
-                <w:sz w:val="18"/>
-                <w:szCs w:val="18"/>
-              </w:rPr>
-              <w:t>step_</w:t>
-            </w:r>
-            <w:r>
-              <w:rPr>
-                <w:rFonts w:ascii="Courier New" w:eastAsia="Courier New" w:hAnsi="Courier New" w:cs="Courier New"/>
-                <w:color w:val="D4D4D4"/>
-                <w:sz w:val="18"/>
-                <w:szCs w:val="18"/>
-              </w:rPr>
-              <w:t>id</w:t>
             </w:r>
             <w:proofErr w:type="spellEnd"/>
             <w:r>
@@ -15509,13 +15356,7 @@
         <w:rPr>
           <w:color w:val="000000"/>
         </w:rPr>
-        <w:t xml:space="preserve"> (resolução diferente, tema mudou, janela não maximizada), use</w:t>
-      </w:r>
-      <w:r>
-        <w:rPr>
-          <w:color w:val="000000"/>
-        </w:rPr>
-        <w:t xml:space="preserve"> coordenadas fixas como </w:t>
+        <w:t xml:space="preserve"> (resolução diferente, tema mudou, janela não maximizada), use coordenadas fixas como </w:t>
       </w:r>
       <w:proofErr w:type="spellStart"/>
       <w:r>
@@ -15871,16 +15712,7 @@
                 <w:sz w:val="18"/>
                 <w:szCs w:val="18"/>
               </w:rPr>
-              <w:t>= (4</w:t>
-            </w:r>
-            <w:r>
-              <w:rPr>
-                <w:rFonts w:ascii="Courier New" w:eastAsia="Courier New" w:hAnsi="Courier New" w:cs="Courier New"/>
-                <w:color w:val="D4D4D4"/>
-                <w:sz w:val="18"/>
-                <w:szCs w:val="18"/>
-              </w:rPr>
-              <w:t>6,  52)    # botão Salvar na toolbar</w:t>
+              <w:t>= (46,  52)    # botão Salvar na toolbar</w:t>
             </w:r>
           </w:p>
           <w:p/>
@@ -16211,16 +16043,7 @@
                 <w:sz w:val="18"/>
                 <w:szCs w:val="18"/>
               </w:rPr>
-              <w:t xml:space="preserve"> encont</w:t>
-            </w:r>
-            <w:r>
-              <w:rPr>
-                <w:rFonts w:ascii="Courier New" w:eastAsia="Courier New" w:hAnsi="Courier New" w:cs="Courier New"/>
-                <w:color w:val="D4D4D4"/>
-                <w:sz w:val="18"/>
-                <w:szCs w:val="18"/>
-              </w:rPr>
-              <w:t>rou:</w:t>
+              <w:t xml:space="preserve"> encontrou:</w:t>
             </w:r>
           </w:p>
           <w:p>
@@ -16969,15 +16792,7 @@
                 <w:bCs/>
                 <w:color w:val="1F4E79"/>
               </w:rPr>
-              <w:t xml:space="preserve">Quando </w:t>
-            </w:r>
-            <w:r>
-              <w:rPr>
-                <w:b/>
-                <w:bCs/>
-                <w:color w:val="1F4E79"/>
-              </w:rPr>
-              <w:t>usar coordenadas</w:t>
+              <w:t>Quando usar coordenadas</w:t>
             </w:r>
           </w:p>
           <w:p>
@@ -19047,16 +18862,7 @@
                 <w:sz w:val="18"/>
                 <w:szCs w:val="18"/>
               </w:rPr>
-              <w:t>':     ''</w:t>
-            </w:r>
-            <w:r>
-              <w:rPr>
-                <w:rFonts w:ascii="Courier New" w:eastAsia="Courier New" w:hAnsi="Courier New" w:cs="Courier New"/>
-                <w:color w:val="D4D4D4"/>
-                <w:sz w:val="18"/>
-                <w:szCs w:val="18"/>
-              </w:rPr>
-              <w:t xml:space="preserve">,                  # vazio = usa o </w:t>
+              <w:t xml:space="preserve">':     '',                  # vazio = usa o </w:t>
             </w:r>
             <w:proofErr w:type="gramStart"/>
             <w:r>
@@ -19275,16 +19081,7 @@
                 <w:sz w:val="18"/>
                 <w:szCs w:val="18"/>
               </w:rPr>
-              <w:t xml:space="preserve">    'sexo'</w:t>
-            </w:r>
-            <w:r>
-              <w:rPr>
-                <w:rFonts w:ascii="Courier New" w:eastAsia="Courier New" w:hAnsi="Courier New" w:cs="Courier New"/>
-                <w:color w:val="D4D4D4"/>
-                <w:sz w:val="18"/>
-                <w:szCs w:val="18"/>
-              </w:rPr>
-              <w:t xml:space="preserve">:            </w:t>
+              <w:t xml:space="preserve">    'sexo':            </w:t>
             </w:r>
             <w:proofErr w:type="spellStart"/>
             <w:proofErr w:type="gramStart"/>
@@ -19594,16 +19391,7 @@
                 <w:sz w:val="18"/>
                 <w:szCs w:val="18"/>
               </w:rPr>
-              <w:t xml:space="preserve">    'sequ</w:t>
-            </w:r>
-            <w:r>
-              <w:rPr>
-                <w:rFonts w:ascii="Courier New" w:eastAsia="Courier New" w:hAnsi="Courier New" w:cs="Courier New"/>
-                <w:color w:val="D4D4D4"/>
-                <w:sz w:val="18"/>
-                <w:szCs w:val="18"/>
-              </w:rPr>
-              <w:t xml:space="preserve">encia':       </w:t>
+              <w:t xml:space="preserve">    'sequencia':       </w:t>
             </w:r>
             <w:proofErr w:type="spellStart"/>
             <w:proofErr w:type="gramStart"/>
@@ -20170,13 +19958,7 @@
         <w:rPr>
           <w:color w:val="000000"/>
         </w:rPr>
-        <w:t xml:space="preserve"> centra</w:t>
-      </w:r>
-      <w:r>
-        <w:rPr>
-          <w:color w:val="000000"/>
-        </w:rPr>
-        <w:t xml:space="preserve">liza operações comuns no Oracle APEX. Importe e use nos </w:t>
+        <w:t xml:space="preserve"> centraliza operações comuns no Oracle APEX. Importe e use nos </w:t>
       </w:r>
       <w:proofErr w:type="spellStart"/>
       <w:r>
@@ -20607,16 +20389,7 @@
                 <w:sz w:val="18"/>
                 <w:szCs w:val="18"/>
               </w:rPr>
-              <w:t xml:space="preserve"> =</w:t>
-            </w:r>
-            <w:r>
-              <w:rPr>
-                <w:rFonts w:ascii="Courier New" w:eastAsia="Courier New" w:hAnsi="Courier New" w:cs="Courier New"/>
-                <w:color w:val="D4D4D4"/>
-                <w:sz w:val="18"/>
-                <w:szCs w:val="18"/>
-              </w:rPr>
-              <w:t xml:space="preserve"> </w:t>
+              <w:t xml:space="preserve"> = </w:t>
             </w:r>
             <w:proofErr w:type="spellStart"/>
             <w:r>
@@ -22050,16 +21823,7 @@
                 <w:sz w:val="18"/>
                 <w:szCs w:val="18"/>
               </w:rPr>
-              <w:t># bu</w:t>
-            </w:r>
-            <w:r>
-              <w:rPr>
-                <w:rFonts w:ascii="Courier New" w:eastAsia="Courier New" w:hAnsi="Courier New" w:cs="Courier New"/>
-                <w:color w:val="D4D4D4"/>
-                <w:sz w:val="18"/>
-                <w:szCs w:val="18"/>
-              </w:rPr>
-              <w:t>sca tolerante — aceita erros de OCR</w:t>
+              <w:t># busca tolerante — aceita erros de OCR</w:t>
             </w:r>
           </w:p>
           <w:p>
@@ -22716,13 +22480,7 @@
         <w:rPr>
           <w:color w:val="000000"/>
         </w:rPr>
-        <w:t xml:space="preserve"> não encontrado' ou '</w:t>
-      </w:r>
-      <w:r>
-        <w:rPr>
-          <w:color w:val="000000"/>
-        </w:rPr>
-        <w:t xml:space="preserve">Elemento não encontrado após </w:t>
+        <w:t xml:space="preserve"> não encontrado' ou 'Elemento não encontrado após </w:t>
       </w:r>
       <w:proofErr w:type="gramStart"/>
       <w:r>
@@ -22835,10 +22593,7 @@
       </w:r>
       <w:proofErr w:type="spellEnd"/>
       <w:r>
-        <w:t xml:space="preserve"> — inclua bordas </w:t>
-      </w:r>
-      <w:r>
-        <w:t>e contexto ao redor</w:t>
+        <w:t xml:space="preserve"> — inclua bordas e contexto ao redor</w:t>
       </w:r>
     </w:p>
     <w:p>
@@ -23079,13 +22834,7 @@
         <w:rPr>
           <w:color w:val="000000"/>
         </w:rPr>
-        <w:t>No</w:t>
-      </w:r>
-      <w:r>
-        <w:rPr>
-          <w:color w:val="000000"/>
-        </w:rPr>
-        <w:t xml:space="preserve"> Oracle </w:t>
+        <w:t xml:space="preserve">No Oracle </w:t>
       </w:r>
       <w:proofErr w:type="spellStart"/>
       <w:r>
@@ -23193,10 +22942,7 @@
       <w:proofErr w:type="spellStart"/>
       <w:proofErr w:type="gramStart"/>
       <w:r>
-        <w:t>pyautogui</w:t>
-      </w:r>
-      <w:r>
-        <w:t>.</w:t>
+        <w:t>pyautogui.</w:t>
       </w:r>
       <w:proofErr w:type="gramEnd"/>
       <w:r>
@@ -27251,6 +26997,23 @@
       <w:pPr>
         <w:spacing w:after="80"/>
       </w:pPr>
+    </w:p>
+    <w:p>
+      <w:pPr>
+        <w:spacing w:after="80"/>
+      </w:pPr>
+    </w:p>
+    <w:p>
+      <w:pPr>
+        <w:spacing w:after="80"/>
+      </w:pPr>
+    </w:p>
+    <w:p>
+      <w:pPr>
+        <w:spacing w:after="80"/>
+      </w:pPr>
+      <w:bookmarkStart w:id="0" w:name="_GoBack"/>
+      <w:bookmarkEnd w:id="0"/>
     </w:p>
     <w:sectPr>
       <w:headerReference w:type="default" r:id="rId8"/>
@@ -27907,6 +27670,33 @@
       <w:szCs w:val="20"/>
     </w:rPr>
   </w:style>
+  <w:style w:type="paragraph" w:styleId="Textodebalo">
+    <w:name w:val="Balloon Text"/>
+    <w:basedOn w:val="Normal"/>
+    <w:link w:val="TextodebaloChar"/>
+    <w:uiPriority w:val="99"/>
+    <w:semiHidden/>
+    <w:unhideWhenUsed/>
+    <w:rsid w:val="00AF53D5"/>
+    <w:rPr>
+      <w:rFonts w:ascii="Tahoma" w:hAnsi="Tahoma" w:cs="Tahoma"/>
+      <w:sz w:val="16"/>
+      <w:szCs w:val="16"/>
+    </w:rPr>
+  </w:style>
+  <w:style w:type="character" w:customStyle="1" w:styleId="TextodebaloChar">
+    <w:name w:val="Texto de balão Char"/>
+    <w:basedOn w:val="Fontepargpadro"/>
+    <w:link w:val="Textodebalo"/>
+    <w:uiPriority w:val="99"/>
+    <w:semiHidden/>
+    <w:rsid w:val="00AF53D5"/>
+    <w:rPr>
+      <w:rFonts w:ascii="Tahoma" w:hAnsi="Tahoma" w:cs="Tahoma"/>
+      <w:sz w:val="16"/>
+      <w:szCs w:val="16"/>
+    </w:rPr>
+  </w:style>
 </w:styles>
 </file>
 
@@ -28251,6 +28041,33 @@
       <w:szCs w:val="20"/>
     </w:rPr>
   </w:style>
+  <w:style w:type="paragraph" w:styleId="Textodebalo">
+    <w:name w:val="Balloon Text"/>
+    <w:basedOn w:val="Normal"/>
+    <w:link w:val="TextodebaloChar"/>
+    <w:uiPriority w:val="99"/>
+    <w:semiHidden/>
+    <w:unhideWhenUsed/>
+    <w:rsid w:val="00AF53D5"/>
+    <w:rPr>
+      <w:rFonts w:ascii="Tahoma" w:hAnsi="Tahoma" w:cs="Tahoma"/>
+      <w:sz w:val="16"/>
+      <w:szCs w:val="16"/>
+    </w:rPr>
+  </w:style>
+  <w:style w:type="character" w:customStyle="1" w:styleId="TextodebaloChar">
+    <w:name w:val="Texto de balão Char"/>
+    <w:basedOn w:val="Fontepargpadro"/>
+    <w:link w:val="Textodebalo"/>
+    <w:uiPriority w:val="99"/>
+    <w:semiHidden/>
+    <w:rsid w:val="00AF53D5"/>
+    <w:rPr>
+      <w:rFonts w:ascii="Tahoma" w:hAnsi="Tahoma" w:cs="Tahoma"/>
+      <w:sz w:val="16"/>
+      <w:szCs w:val="16"/>
+    </w:rPr>
+  </w:style>
 </w:styles>
 </file>
 

</xml_diff>